<commit_message>
Add evidence images to lab report
</commit_message>
<xml_diff>
--- a/lab01-java-console/BaoCao_Lab1_CongNgheJava.docx
+++ b/lab01-java-console/BaoCao_Lab1_CongNgheJava.docx
@@ -684,6 +684,388 @@
         <w:t>Bai lab da hoan thanh ung dung Java SE Console theo cau truc Maven, tach rieng lop xu ly So va lop giao dien App, chay dung 5 bai tap theo yeu cau va dong goi thanh file JAR thanh cong.</w:t>
       </w:r>
     </w:p>
+    <w:p>
+      <w:r>
+        <w:br w:type="page"/>
+      </w:r>
+    </w:p>
+    <w:p>
+      <w:pPr>
+        <w:pStyle w:val="Heading1"/>
+      </w:pPr>
+      <w:r>
+        <w:t>9. Hinh anh minh chung</w:t>
+      </w:r>
+    </w:p>
+    <w:p>
+      <w:r>
+        <w:t>Cac anh duoi day la minh chung da chay chuong trinh va kiem thu cac bai theo yeu cau cua Lab 1.</w:t>
+      </w:r>
+    </w:p>
+    <w:p>
+      <w:pPr>
+        <w:jc w:val="center"/>
+      </w:pPr>
+      <w:r>
+        <w:rPr>
+          <w:rFonts w:ascii="Times New Roman" w:hAnsi="Times New Roman" w:eastAsia="Times New Roman"/>
+          <w:b/>
+          <w:sz w:val="24"/>
+        </w:rPr>
+        <w:t>Hinh 1. Minh chung tong quan / bai lon 2</w:t>
+      </w:r>
+    </w:p>
+    <w:p>
+      <w:pPr>
+        <w:jc w:val="center"/>
+      </w:pPr>
+      <w:r>
+        <w:drawing>
+          <wp:inline xmlns:a="http://schemas.openxmlformats.org/drawingml/2006/main" xmlns:pic="http://schemas.openxmlformats.org/drawingml/2006/picture">
+            <wp:extent cx="5669280" cy="3177107"/>
+            <wp:docPr id="1" name="Picture 1"/>
+            <wp:cNvGraphicFramePr>
+              <a:graphicFrameLocks noChangeAspect="1"/>
+            </wp:cNvGraphicFramePr>
+            <a:graphic>
+              <a:graphicData uri="http://schemas.openxmlformats.org/drawingml/2006/picture">
+                <pic:pic>
+                  <pic:nvPicPr>
+                    <pic:cNvPr id="0" name="2.png"/>
+                    <pic:cNvPicPr/>
+                  </pic:nvPicPr>
+                  <pic:blipFill>
+                    <a:blip r:embed="rId9"/>
+                    <a:stretch>
+                      <a:fillRect/>
+                    </a:stretch>
+                  </pic:blipFill>
+                  <pic:spPr>
+                    <a:xfrm>
+                      <a:off x="0" y="0"/>
+                      <a:ext cx="5669280" cy="3177107"/>
+                    </a:xfrm>
+                    <a:prstGeom prst="rect"/>
+                  </pic:spPr>
+                </pic:pic>
+              </a:graphicData>
+            </a:graphic>
+          </wp:inline>
+        </w:drawing>
+      </w:r>
+    </w:p>
+    <w:p>
+      <w:pPr>
+        <w:jc w:val="center"/>
+      </w:pPr>
+      <w:r>
+        <w:rPr>
+          <w:rFonts w:ascii="Times New Roman" w:hAnsi="Times New Roman" w:eastAsia="Times New Roman"/>
+          <w:b/>
+          <w:sz w:val="24"/>
+        </w:rPr>
+        <w:t>Hinh 2. Minh chung tong quan / bai lon 6</w:t>
+      </w:r>
+    </w:p>
+    <w:p>
+      <w:pPr>
+        <w:jc w:val="center"/>
+      </w:pPr>
+      <w:r>
+        <w:drawing>
+          <wp:inline xmlns:a="http://schemas.openxmlformats.org/drawingml/2006/main" xmlns:pic="http://schemas.openxmlformats.org/drawingml/2006/picture">
+            <wp:extent cx="5212080" cy="4524269"/>
+            <wp:docPr id="2" name="Picture 2"/>
+            <wp:cNvGraphicFramePr>
+              <a:graphicFrameLocks noChangeAspect="1"/>
+            </wp:cNvGraphicFramePr>
+            <a:graphic>
+              <a:graphicData uri="http://schemas.openxmlformats.org/drawingml/2006/picture">
+                <pic:pic>
+                  <pic:nvPicPr>
+                    <pic:cNvPr id="0" name="6.png"/>
+                    <pic:cNvPicPr/>
+                  </pic:nvPicPr>
+                  <pic:blipFill>
+                    <a:blip r:embed="rId10"/>
+                    <a:stretch>
+                      <a:fillRect/>
+                    </a:stretch>
+                  </pic:blipFill>
+                  <pic:spPr>
+                    <a:xfrm>
+                      <a:off x="0" y="0"/>
+                      <a:ext cx="5212080" cy="4524269"/>
+                    </a:xfrm>
+                    <a:prstGeom prst="rect"/>
+                  </pic:spPr>
+                </pic:pic>
+              </a:graphicData>
+            </a:graphic>
+          </wp:inline>
+        </w:drawing>
+      </w:r>
+    </w:p>
+    <w:p>
+      <w:pPr>
+        <w:jc w:val="center"/>
+      </w:pPr>
+      <w:r>
+        <w:rPr>
+          <w:rFonts w:ascii="Times New Roman" w:hAnsi="Times New Roman" w:eastAsia="Times New Roman"/>
+          <w:b/>
+          <w:sz w:val="24"/>
+        </w:rPr>
+        <w:t>Hinh 3. Ket qua kiem thu Bai 1</w:t>
+      </w:r>
+    </w:p>
+    <w:p>
+      <w:pPr>
+        <w:jc w:val="center"/>
+      </w:pPr>
+      <w:r>
+        <w:drawing>
+          <wp:inline xmlns:a="http://schemas.openxmlformats.org/drawingml/2006/main" xmlns:pic="http://schemas.openxmlformats.org/drawingml/2006/picture">
+            <wp:extent cx="5303520" cy="2096740"/>
+            <wp:docPr id="3" name="Picture 3"/>
+            <wp:cNvGraphicFramePr>
+              <a:graphicFrameLocks noChangeAspect="1"/>
+            </wp:cNvGraphicFramePr>
+            <a:graphic>
+              <a:graphicData uri="http://schemas.openxmlformats.org/drawingml/2006/picture">
+                <pic:pic>
+                  <pic:nvPicPr>
+                    <pic:cNvPr id="0" name="bai1.png"/>
+                    <pic:cNvPicPr/>
+                  </pic:nvPicPr>
+                  <pic:blipFill>
+                    <a:blip r:embed="rId11"/>
+                    <a:stretch>
+                      <a:fillRect/>
+                    </a:stretch>
+                  </pic:blipFill>
+                  <pic:spPr>
+                    <a:xfrm>
+                      <a:off x="0" y="0"/>
+                      <a:ext cx="5303520" cy="2096740"/>
+                    </a:xfrm>
+                    <a:prstGeom prst="rect"/>
+                  </pic:spPr>
+                </pic:pic>
+              </a:graphicData>
+            </a:graphic>
+          </wp:inline>
+        </w:drawing>
+      </w:r>
+    </w:p>
+    <w:p>
+      <w:pPr>
+        <w:jc w:val="center"/>
+      </w:pPr>
+      <w:r>
+        <w:rPr>
+          <w:rFonts w:ascii="Times New Roman" w:hAnsi="Times New Roman" w:eastAsia="Times New Roman"/>
+          <w:b/>
+          <w:sz w:val="24"/>
+        </w:rPr>
+        <w:t>Hinh 4. Ket qua kiem thu Bai 2</w:t>
+      </w:r>
+    </w:p>
+    <w:p>
+      <w:pPr>
+        <w:jc w:val="center"/>
+      </w:pPr>
+      <w:r>
+        <w:drawing>
+          <wp:inline xmlns:a="http://schemas.openxmlformats.org/drawingml/2006/main" xmlns:pic="http://schemas.openxmlformats.org/drawingml/2006/picture">
+            <wp:extent cx="5303520" cy="2486025"/>
+            <wp:docPr id="4" name="Picture 4"/>
+            <wp:cNvGraphicFramePr>
+              <a:graphicFrameLocks noChangeAspect="1"/>
+            </wp:cNvGraphicFramePr>
+            <a:graphic>
+              <a:graphicData uri="http://schemas.openxmlformats.org/drawingml/2006/picture">
+                <pic:pic>
+                  <pic:nvPicPr>
+                    <pic:cNvPr id="0" name="bai2.png"/>
+                    <pic:cNvPicPr/>
+                  </pic:nvPicPr>
+                  <pic:blipFill>
+                    <a:blip r:embed="rId12"/>
+                    <a:stretch>
+                      <a:fillRect/>
+                    </a:stretch>
+                  </pic:blipFill>
+                  <pic:spPr>
+                    <a:xfrm>
+                      <a:off x="0" y="0"/>
+                      <a:ext cx="5303520" cy="2486025"/>
+                    </a:xfrm>
+                    <a:prstGeom prst="rect"/>
+                  </pic:spPr>
+                </pic:pic>
+              </a:graphicData>
+            </a:graphic>
+          </wp:inline>
+        </w:drawing>
+      </w:r>
+    </w:p>
+    <w:p>
+      <w:pPr>
+        <w:jc w:val="center"/>
+      </w:pPr>
+      <w:r>
+        <w:rPr>
+          <w:rFonts w:ascii="Times New Roman" w:hAnsi="Times New Roman" w:eastAsia="Times New Roman"/>
+          <w:b/>
+          <w:sz w:val="24"/>
+        </w:rPr>
+        <w:t>Hinh 5. Ket qua kiem thu Bai 3</w:t>
+      </w:r>
+    </w:p>
+    <w:p>
+      <w:pPr>
+        <w:jc w:val="center"/>
+      </w:pPr>
+      <w:r>
+        <w:drawing>
+          <wp:inline xmlns:a="http://schemas.openxmlformats.org/drawingml/2006/main" xmlns:pic="http://schemas.openxmlformats.org/drawingml/2006/picture">
+            <wp:extent cx="5303520" cy="4491269"/>
+            <wp:docPr id="5" name="Picture 5"/>
+            <wp:cNvGraphicFramePr>
+              <a:graphicFrameLocks noChangeAspect="1"/>
+            </wp:cNvGraphicFramePr>
+            <a:graphic>
+              <a:graphicData uri="http://schemas.openxmlformats.org/drawingml/2006/picture">
+                <pic:pic>
+                  <pic:nvPicPr>
+                    <pic:cNvPr id="0" name="bai3.png"/>
+                    <pic:cNvPicPr/>
+                  </pic:nvPicPr>
+                  <pic:blipFill>
+                    <a:blip r:embed="rId13"/>
+                    <a:stretch>
+                      <a:fillRect/>
+                    </a:stretch>
+                  </pic:blipFill>
+                  <pic:spPr>
+                    <a:xfrm>
+                      <a:off x="0" y="0"/>
+                      <a:ext cx="5303520" cy="4491269"/>
+                    </a:xfrm>
+                    <a:prstGeom prst="rect"/>
+                  </pic:spPr>
+                </pic:pic>
+              </a:graphicData>
+            </a:graphic>
+          </wp:inline>
+        </w:drawing>
+      </w:r>
+    </w:p>
+    <w:p>
+      <w:pPr>
+        <w:jc w:val="center"/>
+      </w:pPr>
+      <w:r>
+        <w:rPr>
+          <w:rFonts w:ascii="Times New Roman" w:hAnsi="Times New Roman" w:eastAsia="Times New Roman"/>
+          <w:b/>
+          <w:sz w:val="24"/>
+        </w:rPr>
+        <w:t>Hinh 6. Ket qua kiem thu Bai 4</w:t>
+      </w:r>
+    </w:p>
+    <w:p>
+      <w:pPr>
+        <w:jc w:val="center"/>
+      </w:pPr>
+      <w:r>
+        <w:drawing>
+          <wp:inline xmlns:a="http://schemas.openxmlformats.org/drawingml/2006/main" xmlns:pic="http://schemas.openxmlformats.org/drawingml/2006/picture">
+            <wp:extent cx="5669280" cy="4796554"/>
+            <wp:docPr id="6" name="Picture 6"/>
+            <wp:cNvGraphicFramePr>
+              <a:graphicFrameLocks noChangeAspect="1"/>
+            </wp:cNvGraphicFramePr>
+            <a:graphic>
+              <a:graphicData uri="http://schemas.openxmlformats.org/drawingml/2006/picture">
+                <pic:pic>
+                  <pic:nvPicPr>
+                    <pic:cNvPr id="0" name="bai4.png"/>
+                    <pic:cNvPicPr/>
+                  </pic:nvPicPr>
+                  <pic:blipFill>
+                    <a:blip r:embed="rId14"/>
+                    <a:stretch>
+                      <a:fillRect/>
+                    </a:stretch>
+                  </pic:blipFill>
+                  <pic:spPr>
+                    <a:xfrm>
+                      <a:off x="0" y="0"/>
+                      <a:ext cx="5669280" cy="4796554"/>
+                    </a:xfrm>
+                    <a:prstGeom prst="rect"/>
+                  </pic:spPr>
+                </pic:pic>
+              </a:graphicData>
+            </a:graphic>
+          </wp:inline>
+        </w:drawing>
+      </w:r>
+    </w:p>
+    <w:p>
+      <w:pPr>
+        <w:jc w:val="center"/>
+      </w:pPr>
+      <w:r>
+        <w:rPr>
+          <w:rFonts w:ascii="Times New Roman" w:hAnsi="Times New Roman" w:eastAsia="Times New Roman"/>
+          <w:b/>
+          <w:sz w:val="24"/>
+        </w:rPr>
+        <w:t>Hinh 7. Ket qua kiem thu Bai 5</w:t>
+      </w:r>
+    </w:p>
+    <w:p>
+      <w:pPr>
+        <w:jc w:val="center"/>
+      </w:pPr>
+      <w:r>
+        <w:drawing>
+          <wp:inline xmlns:a="http://schemas.openxmlformats.org/drawingml/2006/main" xmlns:pic="http://schemas.openxmlformats.org/drawingml/2006/picture">
+            <wp:extent cx="5303520" cy="2227478"/>
+            <wp:docPr id="7" name="Picture 7"/>
+            <wp:cNvGraphicFramePr>
+              <a:graphicFrameLocks noChangeAspect="1"/>
+            </wp:cNvGraphicFramePr>
+            <a:graphic>
+              <a:graphicData uri="http://schemas.openxmlformats.org/drawingml/2006/picture">
+                <pic:pic>
+                  <pic:nvPicPr>
+                    <pic:cNvPr id="0" name="bai5.png"/>
+                    <pic:cNvPicPr/>
+                  </pic:nvPicPr>
+                  <pic:blipFill>
+                    <a:blip r:embed="rId15"/>
+                    <a:stretch>
+                      <a:fillRect/>
+                    </a:stretch>
+                  </pic:blipFill>
+                  <pic:spPr>
+                    <a:xfrm>
+                      <a:off x="0" y="0"/>
+                      <a:ext cx="5303520" cy="2227478"/>
+                    </a:xfrm>
+                    <a:prstGeom prst="rect"/>
+                  </pic:spPr>
+                </pic:pic>
+              </a:graphicData>
+            </a:graphic>
+          </wp:inline>
+        </w:drawing>
+      </w:r>
+    </w:p>
     <w:sectPr>
       <w:pgSz w:w="12240" w:h="15840"/>
       <w:pgMar w:top="1008" w:right="1152" w:bottom="1008" w:left="1152" w:header="720" w:footer="720" w:gutter="0"/>

</xml_diff>

<commit_message>
Place evidence images in report sections
</commit_message>
<xml_diff>
--- a/lab01-java-console/BaoCao_Lab1_CongNgheJava.docx
+++ b/lab01-java-console/BaoCao_Lab1_CongNgheJava.docx
@@ -245,8 +245,54 @@
       </w:r>
     </w:p>
     <w:p>
+      <w:pPr>
+        <w:jc w:val="center"/>
+      </w:pPr>
       <w:r>
-        <w:t>Minh chung can chen/chup: Anh man hinh ket qua 3 lenh tren trong Terminal.</w:t>
+        <w:rPr>
+          <w:b/>
+          <w:sz w:val="24"/>
+        </w:rPr>
+        <w:t>Hinh 1. Minh chung kiem tra moi truong / bai lon 2</w:t>
+      </w:r>
+    </w:p>
+    <w:p>
+      <w:pPr>
+        <w:jc w:val="center"/>
+      </w:pPr>
+      <w:r>
+        <w:drawing>
+          <wp:inline xmlns:a="http://schemas.openxmlformats.org/drawingml/2006/main" xmlns:pic="http://schemas.openxmlformats.org/drawingml/2006/picture">
+            <wp:extent cx="5669280" cy="3177107"/>
+            <wp:docPr id="1" name="Picture 1"/>
+            <wp:cNvGraphicFramePr>
+              <a:graphicFrameLocks noChangeAspect="1"/>
+            </wp:cNvGraphicFramePr>
+            <a:graphic>
+              <a:graphicData uri="http://schemas.openxmlformats.org/drawingml/2006/picture">
+                <pic:pic>
+                  <pic:nvPicPr>
+                    <pic:cNvPr id="0" name="2.png"/>
+                    <pic:cNvPicPr/>
+                  </pic:nvPicPr>
+                  <pic:blipFill>
+                    <a:blip r:embed="rId9"/>
+                    <a:stretch>
+                      <a:fillRect/>
+                    </a:stretch>
+                  </pic:blipFill>
+                  <pic:spPr>
+                    <a:xfrm>
+                      <a:off x="0" y="0"/>
+                      <a:ext cx="5669280" cy="3177107"/>
+                    </a:xfrm>
+                    <a:prstGeom prst="rect"/>
+                  </pic:spPr>
+                </pic:pic>
+              </a:graphicData>
+            </a:graphic>
+          </wp:inline>
+        </w:drawing>
       </w:r>
     </w:p>
     <w:p>
@@ -606,8 +652,258 @@
       </w:tr>
     </w:tbl>
     <w:p>
+      <w:pPr>
+        <w:jc w:val="center"/>
+      </w:pPr>
       <w:r>
-        <w:t>Minh chung can chen/chup: Anh man hinh menu chuong trinh va ket qua chay du 5 bai tap.</w:t>
+        <w:rPr>
+          <w:b/>
+          <w:sz w:val="24"/>
+        </w:rPr>
+        <w:t>Hinh 2. Ket qua kiem thu Bai 1</w:t>
+      </w:r>
+    </w:p>
+    <w:p>
+      <w:pPr>
+        <w:jc w:val="center"/>
+      </w:pPr>
+      <w:r>
+        <w:drawing>
+          <wp:inline xmlns:a="http://schemas.openxmlformats.org/drawingml/2006/main" xmlns:pic="http://schemas.openxmlformats.org/drawingml/2006/picture">
+            <wp:extent cx="5303520" cy="2096740"/>
+            <wp:docPr id="2" name="Picture 2"/>
+            <wp:cNvGraphicFramePr>
+              <a:graphicFrameLocks noChangeAspect="1"/>
+            </wp:cNvGraphicFramePr>
+            <a:graphic>
+              <a:graphicData uri="http://schemas.openxmlformats.org/drawingml/2006/picture">
+                <pic:pic>
+                  <pic:nvPicPr>
+                    <pic:cNvPr id="0" name="bai1.png"/>
+                    <pic:cNvPicPr/>
+                  </pic:nvPicPr>
+                  <pic:blipFill>
+                    <a:blip r:embed="rId10"/>
+                    <a:stretch>
+                      <a:fillRect/>
+                    </a:stretch>
+                  </pic:blipFill>
+                  <pic:spPr>
+                    <a:xfrm>
+                      <a:off x="0" y="0"/>
+                      <a:ext cx="5303520" cy="2096740"/>
+                    </a:xfrm>
+                    <a:prstGeom prst="rect"/>
+                  </pic:spPr>
+                </pic:pic>
+              </a:graphicData>
+            </a:graphic>
+          </wp:inline>
+        </w:drawing>
+      </w:r>
+    </w:p>
+    <w:p>
+      <w:pPr>
+        <w:jc w:val="center"/>
+      </w:pPr>
+      <w:r>
+        <w:rPr>
+          <w:b/>
+          <w:sz w:val="24"/>
+        </w:rPr>
+        <w:t>Hinh 3. Ket qua kiem thu Bai 2</w:t>
+      </w:r>
+    </w:p>
+    <w:p>
+      <w:pPr>
+        <w:jc w:val="center"/>
+      </w:pPr>
+      <w:r>
+        <w:drawing>
+          <wp:inline xmlns:a="http://schemas.openxmlformats.org/drawingml/2006/main" xmlns:pic="http://schemas.openxmlformats.org/drawingml/2006/picture">
+            <wp:extent cx="5303520" cy="2486025"/>
+            <wp:docPr id="3" name="Picture 3"/>
+            <wp:cNvGraphicFramePr>
+              <a:graphicFrameLocks noChangeAspect="1"/>
+            </wp:cNvGraphicFramePr>
+            <a:graphic>
+              <a:graphicData uri="http://schemas.openxmlformats.org/drawingml/2006/picture">
+                <pic:pic>
+                  <pic:nvPicPr>
+                    <pic:cNvPr id="0" name="bai2.png"/>
+                    <pic:cNvPicPr/>
+                  </pic:nvPicPr>
+                  <pic:blipFill>
+                    <a:blip r:embed="rId11"/>
+                    <a:stretch>
+                      <a:fillRect/>
+                    </a:stretch>
+                  </pic:blipFill>
+                  <pic:spPr>
+                    <a:xfrm>
+                      <a:off x="0" y="0"/>
+                      <a:ext cx="5303520" cy="2486025"/>
+                    </a:xfrm>
+                    <a:prstGeom prst="rect"/>
+                  </pic:spPr>
+                </pic:pic>
+              </a:graphicData>
+            </a:graphic>
+          </wp:inline>
+        </w:drawing>
+      </w:r>
+    </w:p>
+    <w:p>
+      <w:pPr>
+        <w:jc w:val="center"/>
+      </w:pPr>
+      <w:r>
+        <w:rPr>
+          <w:b/>
+          <w:sz w:val="24"/>
+        </w:rPr>
+        <w:t>Hinh 4. Ket qua kiem thu Bai 3</w:t>
+      </w:r>
+    </w:p>
+    <w:p>
+      <w:pPr>
+        <w:jc w:val="center"/>
+      </w:pPr>
+      <w:r>
+        <w:drawing>
+          <wp:inline xmlns:a="http://schemas.openxmlformats.org/drawingml/2006/main" xmlns:pic="http://schemas.openxmlformats.org/drawingml/2006/picture">
+            <wp:extent cx="5303520" cy="4491269"/>
+            <wp:docPr id="4" name="Picture 4"/>
+            <wp:cNvGraphicFramePr>
+              <a:graphicFrameLocks noChangeAspect="1"/>
+            </wp:cNvGraphicFramePr>
+            <a:graphic>
+              <a:graphicData uri="http://schemas.openxmlformats.org/drawingml/2006/picture">
+                <pic:pic>
+                  <pic:nvPicPr>
+                    <pic:cNvPr id="0" name="bai3.png"/>
+                    <pic:cNvPicPr/>
+                  </pic:nvPicPr>
+                  <pic:blipFill>
+                    <a:blip r:embed="rId12"/>
+                    <a:stretch>
+                      <a:fillRect/>
+                    </a:stretch>
+                  </pic:blipFill>
+                  <pic:spPr>
+                    <a:xfrm>
+                      <a:off x="0" y="0"/>
+                      <a:ext cx="5303520" cy="4491269"/>
+                    </a:xfrm>
+                    <a:prstGeom prst="rect"/>
+                  </pic:spPr>
+                </pic:pic>
+              </a:graphicData>
+            </a:graphic>
+          </wp:inline>
+        </w:drawing>
+      </w:r>
+    </w:p>
+    <w:p>
+      <w:pPr>
+        <w:jc w:val="center"/>
+      </w:pPr>
+      <w:r>
+        <w:rPr>
+          <w:b/>
+          <w:sz w:val="24"/>
+        </w:rPr>
+        <w:t>Hinh 5. Ket qua kiem thu Bai 4</w:t>
+      </w:r>
+    </w:p>
+    <w:p>
+      <w:pPr>
+        <w:jc w:val="center"/>
+      </w:pPr>
+      <w:r>
+        <w:drawing>
+          <wp:inline xmlns:a="http://schemas.openxmlformats.org/drawingml/2006/main" xmlns:pic="http://schemas.openxmlformats.org/drawingml/2006/picture">
+            <wp:extent cx="5669280" cy="4796554"/>
+            <wp:docPr id="5" name="Picture 5"/>
+            <wp:cNvGraphicFramePr>
+              <a:graphicFrameLocks noChangeAspect="1"/>
+            </wp:cNvGraphicFramePr>
+            <a:graphic>
+              <a:graphicData uri="http://schemas.openxmlformats.org/drawingml/2006/picture">
+                <pic:pic>
+                  <pic:nvPicPr>
+                    <pic:cNvPr id="0" name="bai4.png"/>
+                    <pic:cNvPicPr/>
+                  </pic:nvPicPr>
+                  <pic:blipFill>
+                    <a:blip r:embed="rId13"/>
+                    <a:stretch>
+                      <a:fillRect/>
+                    </a:stretch>
+                  </pic:blipFill>
+                  <pic:spPr>
+                    <a:xfrm>
+                      <a:off x="0" y="0"/>
+                      <a:ext cx="5669280" cy="4796554"/>
+                    </a:xfrm>
+                    <a:prstGeom prst="rect"/>
+                  </pic:spPr>
+                </pic:pic>
+              </a:graphicData>
+            </a:graphic>
+          </wp:inline>
+        </w:drawing>
+      </w:r>
+    </w:p>
+    <w:p>
+      <w:pPr>
+        <w:jc w:val="center"/>
+      </w:pPr>
+      <w:r>
+        <w:rPr>
+          <w:b/>
+          <w:sz w:val="24"/>
+        </w:rPr>
+        <w:t>Hinh 6. Ket qua kiem thu Bai 5</w:t>
+      </w:r>
+    </w:p>
+    <w:p>
+      <w:pPr>
+        <w:jc w:val="center"/>
+      </w:pPr>
+      <w:r>
+        <w:drawing>
+          <wp:inline xmlns:a="http://schemas.openxmlformats.org/drawingml/2006/main" xmlns:pic="http://schemas.openxmlformats.org/drawingml/2006/picture">
+            <wp:extent cx="5303520" cy="2227478"/>
+            <wp:docPr id="6" name="Picture 6"/>
+            <wp:cNvGraphicFramePr>
+              <a:graphicFrameLocks noChangeAspect="1"/>
+            </wp:cNvGraphicFramePr>
+            <a:graphic>
+              <a:graphicData uri="http://schemas.openxmlformats.org/drawingml/2006/picture">
+                <pic:pic>
+                  <pic:nvPicPr>
+                    <pic:cNvPr id="0" name="bai5.png"/>
+                    <pic:cNvPicPr/>
+                  </pic:nvPicPr>
+                  <pic:blipFill>
+                    <a:blip r:embed="rId14"/>
+                    <a:stretch>
+                      <a:fillRect/>
+                    </a:stretch>
+                  </pic:blipFill>
+                  <pic:spPr>
+                    <a:xfrm>
+                      <a:off x="0" y="0"/>
+                      <a:ext cx="5303520" cy="2227478"/>
+                    </a:xfrm>
+                    <a:prstGeom prst="rect"/>
+                  </pic:spPr>
+                </pic:pic>
+              </a:graphicData>
+            </a:graphic>
+          </wp:inline>
+        </w:drawing>
       </w:r>
     </w:p>
     <w:p>
@@ -654,8 +950,54 @@
       </w:r>
     </w:p>
     <w:p>
+      <w:pPr>
+        <w:jc w:val="center"/>
+      </w:pPr>
       <w:r>
-        <w:t>Minh chung can chen/chup: Anh man hinh lenh mvn clean package BUILD SUCCESS va anh chay file JAR bang java -jar.</w:t>
+        <w:rPr>
+          <w:b/>
+          <w:sz w:val="24"/>
+        </w:rPr>
+        <w:t>Hinh 7. Minh chung build/chay JAR / bai lon 6</w:t>
+      </w:r>
+    </w:p>
+    <w:p>
+      <w:pPr>
+        <w:jc w:val="center"/>
+      </w:pPr>
+      <w:r>
+        <w:drawing>
+          <wp:inline xmlns:a="http://schemas.openxmlformats.org/drawingml/2006/main" xmlns:pic="http://schemas.openxmlformats.org/drawingml/2006/picture">
+            <wp:extent cx="5212080" cy="4524269"/>
+            <wp:docPr id="7" name="Picture 7"/>
+            <wp:cNvGraphicFramePr>
+              <a:graphicFrameLocks noChangeAspect="1"/>
+            </wp:cNvGraphicFramePr>
+            <a:graphic>
+              <a:graphicData uri="http://schemas.openxmlformats.org/drawingml/2006/picture">
+                <pic:pic>
+                  <pic:nvPicPr>
+                    <pic:cNvPr id="0" name="6.png"/>
+                    <pic:cNvPicPr/>
+                  </pic:nvPicPr>
+                  <pic:blipFill>
+                    <a:blip r:embed="rId15"/>
+                    <a:stretch>
+                      <a:fillRect/>
+                    </a:stretch>
+                  </pic:blipFill>
+                  <pic:spPr>
+                    <a:xfrm>
+                      <a:off x="0" y="0"/>
+                      <a:ext cx="5212080" cy="4524269"/>
+                    </a:xfrm>
+                    <a:prstGeom prst="rect"/>
+                  </pic:spPr>
+                </pic:pic>
+              </a:graphicData>
+            </a:graphic>
+          </wp:inline>
+        </w:drawing>
       </w:r>
     </w:p>
     <w:p>
@@ -682,388 +1024,6 @@
     <w:p>
       <w:r>
         <w:t>Bai lab da hoan thanh ung dung Java SE Console theo cau truc Maven, tach rieng lop xu ly So va lop giao dien App, chay dung 5 bai tap theo yeu cau va dong goi thanh file JAR thanh cong.</w:t>
-      </w:r>
-    </w:p>
-    <w:p>
-      <w:r>
-        <w:br w:type="page"/>
-      </w:r>
-    </w:p>
-    <w:p>
-      <w:pPr>
-        <w:pStyle w:val="Heading1"/>
-      </w:pPr>
-      <w:r>
-        <w:t>9. Hinh anh minh chung</w:t>
-      </w:r>
-    </w:p>
-    <w:p>
-      <w:r>
-        <w:t>Cac anh duoi day la minh chung da chay chuong trinh va kiem thu cac bai theo yeu cau cua Lab 1.</w:t>
-      </w:r>
-    </w:p>
-    <w:p>
-      <w:pPr>
-        <w:jc w:val="center"/>
-      </w:pPr>
-      <w:r>
-        <w:rPr>
-          <w:rFonts w:ascii="Times New Roman" w:hAnsi="Times New Roman" w:eastAsia="Times New Roman"/>
-          <w:b/>
-          <w:sz w:val="24"/>
-        </w:rPr>
-        <w:t>Hinh 1. Minh chung tong quan / bai lon 2</w:t>
-      </w:r>
-    </w:p>
-    <w:p>
-      <w:pPr>
-        <w:jc w:val="center"/>
-      </w:pPr>
-      <w:r>
-        <w:drawing>
-          <wp:inline xmlns:a="http://schemas.openxmlformats.org/drawingml/2006/main" xmlns:pic="http://schemas.openxmlformats.org/drawingml/2006/picture">
-            <wp:extent cx="5669280" cy="3177107"/>
-            <wp:docPr id="1" name="Picture 1"/>
-            <wp:cNvGraphicFramePr>
-              <a:graphicFrameLocks noChangeAspect="1"/>
-            </wp:cNvGraphicFramePr>
-            <a:graphic>
-              <a:graphicData uri="http://schemas.openxmlformats.org/drawingml/2006/picture">
-                <pic:pic>
-                  <pic:nvPicPr>
-                    <pic:cNvPr id="0" name="2.png"/>
-                    <pic:cNvPicPr/>
-                  </pic:nvPicPr>
-                  <pic:blipFill>
-                    <a:blip r:embed="rId9"/>
-                    <a:stretch>
-                      <a:fillRect/>
-                    </a:stretch>
-                  </pic:blipFill>
-                  <pic:spPr>
-                    <a:xfrm>
-                      <a:off x="0" y="0"/>
-                      <a:ext cx="5669280" cy="3177107"/>
-                    </a:xfrm>
-                    <a:prstGeom prst="rect"/>
-                  </pic:spPr>
-                </pic:pic>
-              </a:graphicData>
-            </a:graphic>
-          </wp:inline>
-        </w:drawing>
-      </w:r>
-    </w:p>
-    <w:p>
-      <w:pPr>
-        <w:jc w:val="center"/>
-      </w:pPr>
-      <w:r>
-        <w:rPr>
-          <w:rFonts w:ascii="Times New Roman" w:hAnsi="Times New Roman" w:eastAsia="Times New Roman"/>
-          <w:b/>
-          <w:sz w:val="24"/>
-        </w:rPr>
-        <w:t>Hinh 2. Minh chung tong quan / bai lon 6</w:t>
-      </w:r>
-    </w:p>
-    <w:p>
-      <w:pPr>
-        <w:jc w:val="center"/>
-      </w:pPr>
-      <w:r>
-        <w:drawing>
-          <wp:inline xmlns:a="http://schemas.openxmlformats.org/drawingml/2006/main" xmlns:pic="http://schemas.openxmlformats.org/drawingml/2006/picture">
-            <wp:extent cx="5212080" cy="4524269"/>
-            <wp:docPr id="2" name="Picture 2"/>
-            <wp:cNvGraphicFramePr>
-              <a:graphicFrameLocks noChangeAspect="1"/>
-            </wp:cNvGraphicFramePr>
-            <a:graphic>
-              <a:graphicData uri="http://schemas.openxmlformats.org/drawingml/2006/picture">
-                <pic:pic>
-                  <pic:nvPicPr>
-                    <pic:cNvPr id="0" name="6.png"/>
-                    <pic:cNvPicPr/>
-                  </pic:nvPicPr>
-                  <pic:blipFill>
-                    <a:blip r:embed="rId10"/>
-                    <a:stretch>
-                      <a:fillRect/>
-                    </a:stretch>
-                  </pic:blipFill>
-                  <pic:spPr>
-                    <a:xfrm>
-                      <a:off x="0" y="0"/>
-                      <a:ext cx="5212080" cy="4524269"/>
-                    </a:xfrm>
-                    <a:prstGeom prst="rect"/>
-                  </pic:spPr>
-                </pic:pic>
-              </a:graphicData>
-            </a:graphic>
-          </wp:inline>
-        </w:drawing>
-      </w:r>
-    </w:p>
-    <w:p>
-      <w:pPr>
-        <w:jc w:val="center"/>
-      </w:pPr>
-      <w:r>
-        <w:rPr>
-          <w:rFonts w:ascii="Times New Roman" w:hAnsi="Times New Roman" w:eastAsia="Times New Roman"/>
-          <w:b/>
-          <w:sz w:val="24"/>
-        </w:rPr>
-        <w:t>Hinh 3. Ket qua kiem thu Bai 1</w:t>
-      </w:r>
-    </w:p>
-    <w:p>
-      <w:pPr>
-        <w:jc w:val="center"/>
-      </w:pPr>
-      <w:r>
-        <w:drawing>
-          <wp:inline xmlns:a="http://schemas.openxmlformats.org/drawingml/2006/main" xmlns:pic="http://schemas.openxmlformats.org/drawingml/2006/picture">
-            <wp:extent cx="5303520" cy="2096740"/>
-            <wp:docPr id="3" name="Picture 3"/>
-            <wp:cNvGraphicFramePr>
-              <a:graphicFrameLocks noChangeAspect="1"/>
-            </wp:cNvGraphicFramePr>
-            <a:graphic>
-              <a:graphicData uri="http://schemas.openxmlformats.org/drawingml/2006/picture">
-                <pic:pic>
-                  <pic:nvPicPr>
-                    <pic:cNvPr id="0" name="bai1.png"/>
-                    <pic:cNvPicPr/>
-                  </pic:nvPicPr>
-                  <pic:blipFill>
-                    <a:blip r:embed="rId11"/>
-                    <a:stretch>
-                      <a:fillRect/>
-                    </a:stretch>
-                  </pic:blipFill>
-                  <pic:spPr>
-                    <a:xfrm>
-                      <a:off x="0" y="0"/>
-                      <a:ext cx="5303520" cy="2096740"/>
-                    </a:xfrm>
-                    <a:prstGeom prst="rect"/>
-                  </pic:spPr>
-                </pic:pic>
-              </a:graphicData>
-            </a:graphic>
-          </wp:inline>
-        </w:drawing>
-      </w:r>
-    </w:p>
-    <w:p>
-      <w:pPr>
-        <w:jc w:val="center"/>
-      </w:pPr>
-      <w:r>
-        <w:rPr>
-          <w:rFonts w:ascii="Times New Roman" w:hAnsi="Times New Roman" w:eastAsia="Times New Roman"/>
-          <w:b/>
-          <w:sz w:val="24"/>
-        </w:rPr>
-        <w:t>Hinh 4. Ket qua kiem thu Bai 2</w:t>
-      </w:r>
-    </w:p>
-    <w:p>
-      <w:pPr>
-        <w:jc w:val="center"/>
-      </w:pPr>
-      <w:r>
-        <w:drawing>
-          <wp:inline xmlns:a="http://schemas.openxmlformats.org/drawingml/2006/main" xmlns:pic="http://schemas.openxmlformats.org/drawingml/2006/picture">
-            <wp:extent cx="5303520" cy="2486025"/>
-            <wp:docPr id="4" name="Picture 4"/>
-            <wp:cNvGraphicFramePr>
-              <a:graphicFrameLocks noChangeAspect="1"/>
-            </wp:cNvGraphicFramePr>
-            <a:graphic>
-              <a:graphicData uri="http://schemas.openxmlformats.org/drawingml/2006/picture">
-                <pic:pic>
-                  <pic:nvPicPr>
-                    <pic:cNvPr id="0" name="bai2.png"/>
-                    <pic:cNvPicPr/>
-                  </pic:nvPicPr>
-                  <pic:blipFill>
-                    <a:blip r:embed="rId12"/>
-                    <a:stretch>
-                      <a:fillRect/>
-                    </a:stretch>
-                  </pic:blipFill>
-                  <pic:spPr>
-                    <a:xfrm>
-                      <a:off x="0" y="0"/>
-                      <a:ext cx="5303520" cy="2486025"/>
-                    </a:xfrm>
-                    <a:prstGeom prst="rect"/>
-                  </pic:spPr>
-                </pic:pic>
-              </a:graphicData>
-            </a:graphic>
-          </wp:inline>
-        </w:drawing>
-      </w:r>
-    </w:p>
-    <w:p>
-      <w:pPr>
-        <w:jc w:val="center"/>
-      </w:pPr>
-      <w:r>
-        <w:rPr>
-          <w:rFonts w:ascii="Times New Roman" w:hAnsi="Times New Roman" w:eastAsia="Times New Roman"/>
-          <w:b/>
-          <w:sz w:val="24"/>
-        </w:rPr>
-        <w:t>Hinh 5. Ket qua kiem thu Bai 3</w:t>
-      </w:r>
-    </w:p>
-    <w:p>
-      <w:pPr>
-        <w:jc w:val="center"/>
-      </w:pPr>
-      <w:r>
-        <w:drawing>
-          <wp:inline xmlns:a="http://schemas.openxmlformats.org/drawingml/2006/main" xmlns:pic="http://schemas.openxmlformats.org/drawingml/2006/picture">
-            <wp:extent cx="5303520" cy="4491269"/>
-            <wp:docPr id="5" name="Picture 5"/>
-            <wp:cNvGraphicFramePr>
-              <a:graphicFrameLocks noChangeAspect="1"/>
-            </wp:cNvGraphicFramePr>
-            <a:graphic>
-              <a:graphicData uri="http://schemas.openxmlformats.org/drawingml/2006/picture">
-                <pic:pic>
-                  <pic:nvPicPr>
-                    <pic:cNvPr id="0" name="bai3.png"/>
-                    <pic:cNvPicPr/>
-                  </pic:nvPicPr>
-                  <pic:blipFill>
-                    <a:blip r:embed="rId13"/>
-                    <a:stretch>
-                      <a:fillRect/>
-                    </a:stretch>
-                  </pic:blipFill>
-                  <pic:spPr>
-                    <a:xfrm>
-                      <a:off x="0" y="0"/>
-                      <a:ext cx="5303520" cy="4491269"/>
-                    </a:xfrm>
-                    <a:prstGeom prst="rect"/>
-                  </pic:spPr>
-                </pic:pic>
-              </a:graphicData>
-            </a:graphic>
-          </wp:inline>
-        </w:drawing>
-      </w:r>
-    </w:p>
-    <w:p>
-      <w:pPr>
-        <w:jc w:val="center"/>
-      </w:pPr>
-      <w:r>
-        <w:rPr>
-          <w:rFonts w:ascii="Times New Roman" w:hAnsi="Times New Roman" w:eastAsia="Times New Roman"/>
-          <w:b/>
-          <w:sz w:val="24"/>
-        </w:rPr>
-        <w:t>Hinh 6. Ket qua kiem thu Bai 4</w:t>
-      </w:r>
-    </w:p>
-    <w:p>
-      <w:pPr>
-        <w:jc w:val="center"/>
-      </w:pPr>
-      <w:r>
-        <w:drawing>
-          <wp:inline xmlns:a="http://schemas.openxmlformats.org/drawingml/2006/main" xmlns:pic="http://schemas.openxmlformats.org/drawingml/2006/picture">
-            <wp:extent cx="5669280" cy="4796554"/>
-            <wp:docPr id="6" name="Picture 6"/>
-            <wp:cNvGraphicFramePr>
-              <a:graphicFrameLocks noChangeAspect="1"/>
-            </wp:cNvGraphicFramePr>
-            <a:graphic>
-              <a:graphicData uri="http://schemas.openxmlformats.org/drawingml/2006/picture">
-                <pic:pic>
-                  <pic:nvPicPr>
-                    <pic:cNvPr id="0" name="bai4.png"/>
-                    <pic:cNvPicPr/>
-                  </pic:nvPicPr>
-                  <pic:blipFill>
-                    <a:blip r:embed="rId14"/>
-                    <a:stretch>
-                      <a:fillRect/>
-                    </a:stretch>
-                  </pic:blipFill>
-                  <pic:spPr>
-                    <a:xfrm>
-                      <a:off x="0" y="0"/>
-                      <a:ext cx="5669280" cy="4796554"/>
-                    </a:xfrm>
-                    <a:prstGeom prst="rect"/>
-                  </pic:spPr>
-                </pic:pic>
-              </a:graphicData>
-            </a:graphic>
-          </wp:inline>
-        </w:drawing>
-      </w:r>
-    </w:p>
-    <w:p>
-      <w:pPr>
-        <w:jc w:val="center"/>
-      </w:pPr>
-      <w:r>
-        <w:rPr>
-          <w:rFonts w:ascii="Times New Roman" w:hAnsi="Times New Roman" w:eastAsia="Times New Roman"/>
-          <w:b/>
-          <w:sz w:val="24"/>
-        </w:rPr>
-        <w:t>Hinh 7. Ket qua kiem thu Bai 5</w:t>
-      </w:r>
-    </w:p>
-    <w:p>
-      <w:pPr>
-        <w:jc w:val="center"/>
-      </w:pPr>
-      <w:r>
-        <w:drawing>
-          <wp:inline xmlns:a="http://schemas.openxmlformats.org/drawingml/2006/main" xmlns:pic="http://schemas.openxmlformats.org/drawingml/2006/picture">
-            <wp:extent cx="5303520" cy="2227478"/>
-            <wp:docPr id="7" name="Picture 7"/>
-            <wp:cNvGraphicFramePr>
-              <a:graphicFrameLocks noChangeAspect="1"/>
-            </wp:cNvGraphicFramePr>
-            <a:graphic>
-              <a:graphicData uri="http://schemas.openxmlformats.org/drawingml/2006/picture">
-                <pic:pic>
-                  <pic:nvPicPr>
-                    <pic:cNvPr id="0" name="bai5.png"/>
-                    <pic:cNvPicPr/>
-                  </pic:nvPicPr>
-                  <pic:blipFill>
-                    <a:blip r:embed="rId15"/>
-                    <a:stretch>
-                      <a:fillRect/>
-                    </a:stretch>
-                  </pic:blipFill>
-                  <pic:spPr>
-                    <a:xfrm>
-                      <a:off x="0" y="0"/>
-                      <a:ext cx="5303520" cy="2227478"/>
-                    </a:xfrm>
-                    <a:prstGeom prst="rect"/>
-                  </pic:spPr>
-                </pic:pic>
-              </a:graphicData>
-            </a:graphic>
-          </wp:inline>
-        </w:drawing>
       </w:r>
     </w:p>
     <w:sectPr>

</xml_diff>